<commit_message>
feat: Introduce predefined data management feature with new settings component, services, types, and templates.
</commit_message>
<xml_diff>
--- a/public/templates/Verbale_Ammissione_Esame_con_placeholder.docx
+++ b/public/templates/Verbale_Ammissione_Esame_con_placeholder.docx
@@ -158,99 +158,26 @@
         <w:spacing w:after="240"/>
         <w:jc w:val="both"/>
       </w:pPr>
-      <w:r>
-        <w:t>Allievo                    Ammissione/non Ammissione    NOTE</w:t>
-      </w:r>
-    </w:p>
-    <w:p>
-      <w:pPr>
-        <w:spacing w:after="240"/>
-        <w:jc w:val="both"/>
-      </w:pPr>
-      <w:r>
-        <w:t>{#PARTECIPANTI}</w:t>
-      </w:r>
-    </w:p>
-    <w:p>
-      <w:pPr>
-        <w:spacing w:after="240"/>
-        <w:jc w:val="both"/>
-      </w:pPr>
-      <w:r>
-        <w:t>{{</w:t>
-      </w:r>
-      <w:proofErr w:type="spellStart"/>
-      <w:r>
-        <w:t>nome_completo</w:t>
-      </w:r>
-      <w:proofErr w:type="spellEnd"/>
-      <w:proofErr w:type="gramStart"/>
-      <w:r>
-        <w:t xml:space="preserve">}}   </w:t>
-      </w:r>
-      <w:proofErr w:type="gramEnd"/>
-      <w:r>
-        <w:t xml:space="preserve">       AMMESSO                      </w:t>
-      </w:r>
-    </w:p>
-    <w:p>
-      <w:pPr>
-        <w:spacing w:after="240"/>
-        <w:jc w:val="both"/>
-      </w:pPr>
-      <w:r>
-        <w:t>{/PARTECIPANTI}</w:t>
-      </w:r>
-    </w:p>
-    <w:p>
-      <w:pPr>
-        <w:spacing w:after="240"/>
-        <w:jc w:val="both"/>
-      </w:pPr>
-    </w:p>
-    <w:p>
-      <w:pPr>
-        <w:spacing w:after="240"/>
-        <w:jc w:val="both"/>
-      </w:pPr>
     </w:p>
     <w:tbl>
       <w:tblPr>
+        <w:tblStyle w:val="TableGrid"/>
         <w:tblW w:w="0" w:type="auto"/>
-        <w:tblBorders>
-          <w:top w:val="single" w:sz="4" w:space="0" w:color="auto"/>
-          <w:left w:val="single" w:sz="4" w:space="0" w:color="auto"/>
-          <w:bottom w:val="single" w:sz="4" w:space="0" w:color="auto"/>
-          <w:right w:val="single" w:sz="4" w:space="0" w:color="auto"/>
-          <w:insideH w:val="single" w:sz="4" w:space="0" w:color="auto"/>
-          <w:insideV w:val="single" w:sz="4" w:space="0" w:color="auto"/>
-        </w:tblBorders>
-        <w:tblCellMar>
-          <w:top w:w="60" w:type="dxa"/>
-          <w:left w:w="100" w:type="dxa"/>
-          <w:bottom w:w="60" w:type="dxa"/>
-          <w:right w:w="100" w:type="dxa"/>
-        </w:tblCellMar>
-        <w:tblLook w:val="0000" w:firstRow="0" w:lastRow="0" w:firstColumn="0" w:lastColumn="0" w:noHBand="0" w:noVBand="0"/>
+        <w:tblLook w:val="04A0" w:firstRow="1" w:lastRow="0" w:firstColumn="1" w:lastColumn="0" w:noHBand="0" w:noVBand="1"/>
       </w:tblPr>
       <w:tblGrid>
-        <w:gridCol w:w="3036"/>
-        <w:gridCol w:w="3032"/>
-        <w:gridCol w:w="2942"/>
+        <w:gridCol w:w="3078"/>
+        <w:gridCol w:w="2965"/>
+        <w:gridCol w:w="2973"/>
       </w:tblGrid>
       <w:tr>
         <w:tc>
           <w:tcPr>
-            <w:tcW w:w="3036" w:type="dxa"/>
-            <w:tcBorders>
-              <w:top w:val="single" w:sz="6" w:space="0" w:color="000000"/>
-              <w:left w:val="single" w:sz="6" w:space="0" w:color="000000"/>
-              <w:bottom w:val="single" w:sz="6" w:space="0" w:color="000000"/>
-              <w:right w:val="single" w:sz="6" w:space="0" w:color="000000"/>
-            </w:tcBorders>
+            <w:tcW w:w="3005" w:type="dxa"/>
           </w:tcPr>
           <w:p>
             <w:pPr>
+              <w:spacing w:after="240"/>
               <w:jc w:val="center"/>
             </w:pPr>
             <w:r>
@@ -264,16 +191,11 @@
         </w:tc>
         <w:tc>
           <w:tcPr>
-            <w:tcW w:w="3032" w:type="dxa"/>
-            <w:tcBorders>
-              <w:top w:val="single" w:sz="6" w:space="0" w:color="000000"/>
-              <w:left w:val="single" w:sz="6" w:space="0" w:color="000000"/>
-              <w:bottom w:val="single" w:sz="6" w:space="0" w:color="000000"/>
-              <w:right w:val="single" w:sz="6" w:space="0" w:color="000000"/>
-            </w:tcBorders>
+            <w:tcW w:w="3005" w:type="dxa"/>
           </w:tcPr>
           <w:p>
             <w:pPr>
+              <w:spacing w:after="240"/>
               <w:jc w:val="center"/>
             </w:pPr>
             <w:r>
@@ -287,18 +209,19 @@
         </w:tc>
         <w:tc>
           <w:tcPr>
-            <w:tcW w:w="2942" w:type="dxa"/>
-            <w:tcBorders>
-              <w:top w:val="single" w:sz="6" w:space="0" w:color="000000"/>
-              <w:left w:val="single" w:sz="6" w:space="0" w:color="000000"/>
-              <w:bottom w:val="single" w:sz="6" w:space="0" w:color="000000"/>
-              <w:right w:val="single" w:sz="6" w:space="0" w:color="000000"/>
-            </w:tcBorders>
+            <w:tcW w:w="3006" w:type="dxa"/>
           </w:tcPr>
           <w:p>
             <w:pPr>
-              <w:jc w:val="center"/>
+              <w:spacing w:after="240"/>
             </w:pPr>
+            <w:r>
+              <w:rPr>
+                <w:b/>
+                <w:bCs/>
+              </w:rPr>
+              <w:t xml:space="preserve">                      </w:t>
+            </w:r>
             <w:r>
               <w:rPr>
                 <w:b/>
@@ -310,489 +233,79 @@
         </w:tc>
       </w:tr>
       <w:tr>
-        <w:trPr>
-          <w:trHeight w:val="600"/>
-        </w:trPr>
         <w:tc>
           <w:tcPr>
-            <w:tcW w:w="3036" w:type="dxa"/>
-            <w:tcBorders>
-              <w:top w:val="single" w:sz="6" w:space="0" w:color="000000"/>
-              <w:left w:val="single" w:sz="6" w:space="0" w:color="000000"/>
-              <w:bottom w:val="single" w:sz="6" w:space="0" w:color="000000"/>
-              <w:right w:val="single" w:sz="6" w:space="0" w:color="000000"/>
-            </w:tcBorders>
+            <w:tcW w:w="3005" w:type="dxa"/>
           </w:tcPr>
           <w:p>
+            <w:pPr>
+              <w:spacing w:after="240"/>
+              <w:jc w:val="both"/>
+            </w:pPr>
+            <w:r>
+              <w:t>{{#PARTECIPANTI</w:t>
+            </w:r>
+            <w:proofErr w:type="gramStart"/>
+            <w:r>
+              <w:t>}}</w:t>
+            </w:r>
             <w:r>
               <w:t>{</w:t>
             </w:r>
-            <w:r>
-              <w:t>{PARTECIPANTE 1}</w:t>
-            </w:r>
-            <w:r>
-              <w:t>}</w:t>
+            <w:proofErr w:type="gramEnd"/>
+            <w:r>
+              <w:t>{nome}}</w:t>
+            </w:r>
+            <w:r>
+              <w:t xml:space="preserve"> </w:t>
+            </w:r>
+            <w:r>
+              <w:t>{{cognome}}</w:t>
             </w:r>
           </w:p>
         </w:tc>
         <w:tc>
           <w:tcPr>
-            <w:tcW w:w="3032" w:type="dxa"/>
-            <w:tcBorders>
-              <w:top w:val="single" w:sz="6" w:space="0" w:color="000000"/>
-              <w:left w:val="single" w:sz="6" w:space="0" w:color="000000"/>
-              <w:bottom w:val="single" w:sz="6" w:space="0" w:color="000000"/>
-              <w:right w:val="single" w:sz="6" w:space="0" w:color="000000"/>
-            </w:tcBorders>
+            <w:tcW w:w="3005" w:type="dxa"/>
           </w:tcPr>
           <w:p>
-            <w:r>
-              <w:rPr>
-                <w:highlight w:val="green"/>
-              </w:rPr>
+            <w:pPr>
+              <w:spacing w:after="240"/>
+              <w:jc w:val="both"/>
+            </w:pPr>
+            <w:r>
               <w:t>AMMESSO</w:t>
             </w:r>
           </w:p>
         </w:tc>
         <w:tc>
           <w:tcPr>
-            <w:tcW w:w="2942" w:type="dxa"/>
-            <w:tcBorders>
-              <w:top w:val="single" w:sz="6" w:space="0" w:color="000000"/>
-              <w:left w:val="single" w:sz="6" w:space="0" w:color="000000"/>
-              <w:bottom w:val="single" w:sz="6" w:space="0" w:color="000000"/>
-              <w:right w:val="single" w:sz="6" w:space="0" w:color="000000"/>
-            </w:tcBorders>
-          </w:tcPr>
-          <w:p/>
-        </w:tc>
-      </w:tr>
-      <w:tr>
-        <w:trPr>
-          <w:trHeight w:val="600"/>
-        </w:trPr>
-        <w:tc>
-          <w:tcPr>
-            <w:tcW w:w="3036" w:type="dxa"/>
-            <w:tcBorders>
-              <w:top w:val="single" w:sz="6" w:space="0" w:color="000000"/>
-              <w:left w:val="single" w:sz="6" w:space="0" w:color="000000"/>
-              <w:bottom w:val="single" w:sz="6" w:space="0" w:color="000000"/>
-              <w:right w:val="single" w:sz="6" w:space="0" w:color="000000"/>
-            </w:tcBorders>
+            <w:tcW w:w="3006" w:type="dxa"/>
           </w:tcPr>
           <w:p>
-            <w:r>
-              <w:t>{{PARTECIPANTE 2}}</w:t>
+            <w:pPr>
+              <w:spacing w:after="240"/>
+              <w:jc w:val="both"/>
+            </w:pPr>
+            <w:r>
+              <w:t>{{/PARTECIPANTI}}</w:t>
             </w:r>
           </w:p>
-        </w:tc>
-        <w:tc>
-          <w:tcPr>
-            <w:tcW w:w="3032" w:type="dxa"/>
-            <w:tcBorders>
-              <w:top w:val="single" w:sz="6" w:space="0" w:color="000000"/>
-              <w:left w:val="single" w:sz="6" w:space="0" w:color="000000"/>
-              <w:bottom w:val="single" w:sz="6" w:space="0" w:color="000000"/>
-              <w:right w:val="single" w:sz="6" w:space="0" w:color="000000"/>
-            </w:tcBorders>
-          </w:tcPr>
-          <w:p>
-            <w:r>
-              <w:rPr>
-                <w:highlight w:val="green"/>
-              </w:rPr>
-              <w:t>AMMESSO</w:t>
-            </w:r>
-          </w:p>
-        </w:tc>
-        <w:tc>
-          <w:tcPr>
-            <w:tcW w:w="2942" w:type="dxa"/>
-            <w:tcBorders>
-              <w:top w:val="single" w:sz="6" w:space="0" w:color="000000"/>
-              <w:left w:val="single" w:sz="6" w:space="0" w:color="000000"/>
-              <w:bottom w:val="single" w:sz="6" w:space="0" w:color="000000"/>
-              <w:right w:val="single" w:sz="6" w:space="0" w:color="000000"/>
-            </w:tcBorders>
-          </w:tcPr>
-          <w:p/>
-        </w:tc>
-      </w:tr>
-      <w:tr>
-        <w:trPr>
-          <w:trHeight w:val="600"/>
-        </w:trPr>
-        <w:tc>
-          <w:tcPr>
-            <w:tcW w:w="3036" w:type="dxa"/>
-            <w:tcBorders>
-              <w:top w:val="single" w:sz="6" w:space="0" w:color="000000"/>
-              <w:left w:val="single" w:sz="6" w:space="0" w:color="000000"/>
-              <w:bottom w:val="single" w:sz="6" w:space="0" w:color="000000"/>
-              <w:right w:val="single" w:sz="6" w:space="0" w:color="000000"/>
-            </w:tcBorders>
-          </w:tcPr>
-          <w:p>
-            <w:r>
-              <w:t>{{PARTECIPANTE 3}}</w:t>
-            </w:r>
-          </w:p>
-        </w:tc>
-        <w:tc>
-          <w:tcPr>
-            <w:tcW w:w="3032" w:type="dxa"/>
-            <w:tcBorders>
-              <w:top w:val="single" w:sz="6" w:space="0" w:color="000000"/>
-              <w:left w:val="single" w:sz="6" w:space="0" w:color="000000"/>
-              <w:bottom w:val="single" w:sz="6" w:space="0" w:color="000000"/>
-              <w:right w:val="single" w:sz="6" w:space="0" w:color="000000"/>
-            </w:tcBorders>
-          </w:tcPr>
-          <w:p>
-            <w:r>
-              <w:rPr>
-                <w:highlight w:val="green"/>
-              </w:rPr>
-              <w:t>AMMESSO</w:t>
-            </w:r>
-          </w:p>
-        </w:tc>
-        <w:tc>
-          <w:tcPr>
-            <w:tcW w:w="2942" w:type="dxa"/>
-            <w:tcBorders>
-              <w:top w:val="single" w:sz="6" w:space="0" w:color="000000"/>
-              <w:left w:val="single" w:sz="6" w:space="0" w:color="000000"/>
-              <w:bottom w:val="single" w:sz="6" w:space="0" w:color="000000"/>
-              <w:right w:val="single" w:sz="6" w:space="0" w:color="000000"/>
-            </w:tcBorders>
-          </w:tcPr>
-          <w:p/>
-        </w:tc>
-      </w:tr>
-      <w:tr>
-        <w:trPr>
-          <w:trHeight w:val="600"/>
-        </w:trPr>
-        <w:tc>
-          <w:tcPr>
-            <w:tcW w:w="3036" w:type="dxa"/>
-            <w:tcBorders>
-              <w:top w:val="single" w:sz="6" w:space="0" w:color="000000"/>
-              <w:left w:val="single" w:sz="6" w:space="0" w:color="000000"/>
-              <w:bottom w:val="single" w:sz="6" w:space="0" w:color="000000"/>
-              <w:right w:val="single" w:sz="6" w:space="0" w:color="000000"/>
-            </w:tcBorders>
-          </w:tcPr>
-          <w:p>
-            <w:r>
-              <w:t>{{PARTECIPANTE 4}}</w:t>
-            </w:r>
-          </w:p>
-        </w:tc>
-        <w:tc>
-          <w:tcPr>
-            <w:tcW w:w="3032" w:type="dxa"/>
-            <w:tcBorders>
-              <w:top w:val="single" w:sz="6" w:space="0" w:color="000000"/>
-              <w:left w:val="single" w:sz="6" w:space="0" w:color="000000"/>
-              <w:bottom w:val="single" w:sz="6" w:space="0" w:color="000000"/>
-              <w:right w:val="single" w:sz="6" w:space="0" w:color="000000"/>
-            </w:tcBorders>
-          </w:tcPr>
-          <w:p>
-            <w:r>
-              <w:rPr>
-                <w:highlight w:val="green"/>
-              </w:rPr>
-              <w:t>AMMESSO</w:t>
-            </w:r>
-          </w:p>
-        </w:tc>
-        <w:tc>
-          <w:tcPr>
-            <w:tcW w:w="2942" w:type="dxa"/>
-            <w:tcBorders>
-              <w:top w:val="single" w:sz="6" w:space="0" w:color="000000"/>
-              <w:left w:val="single" w:sz="6" w:space="0" w:color="000000"/>
-              <w:bottom w:val="single" w:sz="6" w:space="0" w:color="000000"/>
-              <w:right w:val="single" w:sz="6" w:space="0" w:color="000000"/>
-            </w:tcBorders>
-          </w:tcPr>
-          <w:p/>
-        </w:tc>
-      </w:tr>
-      <w:tr>
-        <w:trPr>
-          <w:trHeight w:val="600"/>
-        </w:trPr>
-        <w:tc>
-          <w:tcPr>
-            <w:tcW w:w="3036" w:type="dxa"/>
-            <w:tcBorders>
-              <w:top w:val="single" w:sz="6" w:space="0" w:color="000000"/>
-              <w:left w:val="single" w:sz="6" w:space="0" w:color="000000"/>
-              <w:bottom w:val="single" w:sz="6" w:space="0" w:color="000000"/>
-              <w:right w:val="single" w:sz="6" w:space="0" w:color="000000"/>
-            </w:tcBorders>
-          </w:tcPr>
-          <w:p>
-            <w:r>
-              <w:lastRenderedPageBreak/>
-              <w:t>{{PARTECIPANTE 5}}</w:t>
-            </w:r>
-          </w:p>
-        </w:tc>
-        <w:tc>
-          <w:tcPr>
-            <w:tcW w:w="3032" w:type="dxa"/>
-            <w:tcBorders>
-              <w:top w:val="single" w:sz="6" w:space="0" w:color="000000"/>
-              <w:left w:val="single" w:sz="6" w:space="0" w:color="000000"/>
-              <w:bottom w:val="single" w:sz="6" w:space="0" w:color="000000"/>
-              <w:right w:val="single" w:sz="6" w:space="0" w:color="000000"/>
-            </w:tcBorders>
-          </w:tcPr>
-          <w:p>
-            <w:r>
-              <w:rPr>
-                <w:highlight w:val="green"/>
-              </w:rPr>
-              <w:t>AMMESSO</w:t>
-            </w:r>
-          </w:p>
-        </w:tc>
-        <w:tc>
-          <w:tcPr>
-            <w:tcW w:w="2942" w:type="dxa"/>
-            <w:tcBorders>
-              <w:top w:val="single" w:sz="6" w:space="0" w:color="000000"/>
-              <w:left w:val="single" w:sz="6" w:space="0" w:color="000000"/>
-              <w:bottom w:val="single" w:sz="6" w:space="0" w:color="000000"/>
-              <w:right w:val="single" w:sz="6" w:space="0" w:color="000000"/>
-            </w:tcBorders>
-          </w:tcPr>
-          <w:p/>
-        </w:tc>
-      </w:tr>
-      <w:tr>
-        <w:trPr>
-          <w:trHeight w:val="600"/>
-        </w:trPr>
-        <w:tc>
-          <w:tcPr>
-            <w:tcW w:w="3036" w:type="dxa"/>
-            <w:tcBorders>
-              <w:top w:val="single" w:sz="6" w:space="0" w:color="000000"/>
-              <w:left w:val="single" w:sz="6" w:space="0" w:color="000000"/>
-              <w:bottom w:val="single" w:sz="6" w:space="0" w:color="000000"/>
-              <w:right w:val="single" w:sz="6" w:space="0" w:color="000000"/>
-            </w:tcBorders>
-          </w:tcPr>
-          <w:p>
-            <w:r>
-              <w:t>{{PARTECIPANTE 6}}</w:t>
-            </w:r>
-          </w:p>
-        </w:tc>
-        <w:tc>
-          <w:tcPr>
-            <w:tcW w:w="3032" w:type="dxa"/>
-            <w:tcBorders>
-              <w:top w:val="single" w:sz="6" w:space="0" w:color="000000"/>
-              <w:left w:val="single" w:sz="6" w:space="0" w:color="000000"/>
-              <w:bottom w:val="single" w:sz="6" w:space="0" w:color="000000"/>
-              <w:right w:val="single" w:sz="6" w:space="0" w:color="000000"/>
-            </w:tcBorders>
-          </w:tcPr>
-          <w:p>
-            <w:r>
-              <w:rPr>
-                <w:highlight w:val="green"/>
-              </w:rPr>
-              <w:t>AMMESSO</w:t>
-            </w:r>
-          </w:p>
-        </w:tc>
-        <w:tc>
-          <w:tcPr>
-            <w:tcW w:w="2942" w:type="dxa"/>
-            <w:tcBorders>
-              <w:top w:val="single" w:sz="6" w:space="0" w:color="000000"/>
-              <w:left w:val="single" w:sz="6" w:space="0" w:color="000000"/>
-              <w:bottom w:val="single" w:sz="6" w:space="0" w:color="000000"/>
-              <w:right w:val="single" w:sz="6" w:space="0" w:color="000000"/>
-            </w:tcBorders>
-          </w:tcPr>
-          <w:p/>
-        </w:tc>
-      </w:tr>
-      <w:tr>
-        <w:trPr>
-          <w:trHeight w:val="600"/>
-        </w:trPr>
-        <w:tc>
-          <w:tcPr>
-            <w:tcW w:w="3036" w:type="dxa"/>
-            <w:tcBorders>
-              <w:top w:val="single" w:sz="6" w:space="0" w:color="000000"/>
-              <w:left w:val="single" w:sz="6" w:space="0" w:color="000000"/>
-              <w:bottom w:val="single" w:sz="6" w:space="0" w:color="000000"/>
-              <w:right w:val="single" w:sz="6" w:space="0" w:color="000000"/>
-            </w:tcBorders>
-          </w:tcPr>
-          <w:p/>
-        </w:tc>
-        <w:tc>
-          <w:tcPr>
-            <w:tcW w:w="3032" w:type="dxa"/>
-            <w:tcBorders>
-              <w:top w:val="single" w:sz="6" w:space="0" w:color="000000"/>
-              <w:left w:val="single" w:sz="6" w:space="0" w:color="000000"/>
-              <w:bottom w:val="single" w:sz="6" w:space="0" w:color="000000"/>
-              <w:right w:val="single" w:sz="6" w:space="0" w:color="000000"/>
-            </w:tcBorders>
-          </w:tcPr>
-          <w:p/>
-        </w:tc>
-        <w:tc>
-          <w:tcPr>
-            <w:tcW w:w="2942" w:type="dxa"/>
-            <w:tcBorders>
-              <w:top w:val="single" w:sz="6" w:space="0" w:color="000000"/>
-              <w:left w:val="single" w:sz="6" w:space="0" w:color="000000"/>
-              <w:bottom w:val="single" w:sz="6" w:space="0" w:color="000000"/>
-              <w:right w:val="single" w:sz="6" w:space="0" w:color="000000"/>
-            </w:tcBorders>
-          </w:tcPr>
-          <w:p/>
-        </w:tc>
-      </w:tr>
-      <w:tr>
-        <w:trPr>
-          <w:trHeight w:val="600"/>
-        </w:trPr>
-        <w:tc>
-          <w:tcPr>
-            <w:tcW w:w="3036" w:type="dxa"/>
-            <w:tcBorders>
-              <w:top w:val="single" w:sz="6" w:space="0" w:color="000000"/>
-              <w:left w:val="single" w:sz="6" w:space="0" w:color="000000"/>
-              <w:bottom w:val="single" w:sz="6" w:space="0" w:color="000000"/>
-              <w:right w:val="single" w:sz="6" w:space="0" w:color="000000"/>
-            </w:tcBorders>
-          </w:tcPr>
-          <w:p/>
-        </w:tc>
-        <w:tc>
-          <w:tcPr>
-            <w:tcW w:w="3032" w:type="dxa"/>
-            <w:tcBorders>
-              <w:top w:val="single" w:sz="6" w:space="0" w:color="000000"/>
-              <w:left w:val="single" w:sz="6" w:space="0" w:color="000000"/>
-              <w:bottom w:val="single" w:sz="6" w:space="0" w:color="000000"/>
-              <w:right w:val="single" w:sz="6" w:space="0" w:color="000000"/>
-            </w:tcBorders>
-          </w:tcPr>
-          <w:p/>
-        </w:tc>
-        <w:tc>
-          <w:tcPr>
-            <w:tcW w:w="2942" w:type="dxa"/>
-            <w:tcBorders>
-              <w:top w:val="single" w:sz="6" w:space="0" w:color="000000"/>
-              <w:left w:val="single" w:sz="6" w:space="0" w:color="000000"/>
-              <w:bottom w:val="single" w:sz="6" w:space="0" w:color="000000"/>
-              <w:right w:val="single" w:sz="6" w:space="0" w:color="000000"/>
-            </w:tcBorders>
-          </w:tcPr>
-          <w:p/>
-        </w:tc>
-      </w:tr>
-      <w:tr>
-        <w:trPr>
-          <w:trHeight w:val="600"/>
-        </w:trPr>
-        <w:tc>
-          <w:tcPr>
-            <w:tcW w:w="3036" w:type="dxa"/>
-            <w:tcBorders>
-              <w:top w:val="single" w:sz="6" w:space="0" w:color="000000"/>
-              <w:left w:val="single" w:sz="6" w:space="0" w:color="000000"/>
-              <w:bottom w:val="single" w:sz="6" w:space="0" w:color="000000"/>
-              <w:right w:val="single" w:sz="6" w:space="0" w:color="000000"/>
-            </w:tcBorders>
-          </w:tcPr>
-          <w:p/>
-        </w:tc>
-        <w:tc>
-          <w:tcPr>
-            <w:tcW w:w="3032" w:type="dxa"/>
-            <w:tcBorders>
-              <w:top w:val="single" w:sz="6" w:space="0" w:color="000000"/>
-              <w:left w:val="single" w:sz="6" w:space="0" w:color="000000"/>
-              <w:bottom w:val="single" w:sz="6" w:space="0" w:color="000000"/>
-              <w:right w:val="single" w:sz="6" w:space="0" w:color="000000"/>
-            </w:tcBorders>
-          </w:tcPr>
-          <w:p/>
-        </w:tc>
-        <w:tc>
-          <w:tcPr>
-            <w:tcW w:w="2942" w:type="dxa"/>
-            <w:tcBorders>
-              <w:top w:val="single" w:sz="6" w:space="0" w:color="000000"/>
-              <w:left w:val="single" w:sz="6" w:space="0" w:color="000000"/>
-              <w:bottom w:val="single" w:sz="6" w:space="0" w:color="000000"/>
-              <w:right w:val="single" w:sz="6" w:space="0" w:color="000000"/>
-            </w:tcBorders>
-          </w:tcPr>
-          <w:p/>
-        </w:tc>
-      </w:tr>
-      <w:tr>
-        <w:trPr>
-          <w:trHeight w:val="600"/>
-        </w:trPr>
-        <w:tc>
-          <w:tcPr>
-            <w:tcW w:w="3036" w:type="dxa"/>
-            <w:tcBorders>
-              <w:top w:val="single" w:sz="6" w:space="0" w:color="000000"/>
-              <w:left w:val="single" w:sz="6" w:space="0" w:color="000000"/>
-              <w:bottom w:val="single" w:sz="6" w:space="0" w:color="000000"/>
-              <w:right w:val="single" w:sz="6" w:space="0" w:color="000000"/>
-            </w:tcBorders>
-          </w:tcPr>
-          <w:p/>
-        </w:tc>
-        <w:tc>
-          <w:tcPr>
-            <w:tcW w:w="3032" w:type="dxa"/>
-            <w:tcBorders>
-              <w:top w:val="single" w:sz="6" w:space="0" w:color="000000"/>
-              <w:left w:val="single" w:sz="6" w:space="0" w:color="000000"/>
-              <w:bottom w:val="single" w:sz="6" w:space="0" w:color="000000"/>
-              <w:right w:val="single" w:sz="6" w:space="0" w:color="000000"/>
-            </w:tcBorders>
-          </w:tcPr>
-          <w:p/>
-        </w:tc>
-        <w:tc>
-          <w:tcPr>
-            <w:tcW w:w="2942" w:type="dxa"/>
-            <w:tcBorders>
-              <w:top w:val="single" w:sz="6" w:space="0" w:color="000000"/>
-              <w:left w:val="single" w:sz="6" w:space="0" w:color="000000"/>
-              <w:bottom w:val="single" w:sz="6" w:space="0" w:color="000000"/>
-              <w:right w:val="single" w:sz="6" w:space="0" w:color="000000"/>
-            </w:tcBorders>
-          </w:tcPr>
-          <w:p/>
         </w:tc>
       </w:tr>
     </w:tbl>
+    <w:p>
+      <w:pPr>
+        <w:spacing w:after="240"/>
+        <w:jc w:val="both"/>
+      </w:pPr>
+    </w:p>
+    <w:p>
+      <w:pPr>
+        <w:spacing w:after="240"/>
+        <w:jc w:val="both"/>
+      </w:pPr>
+    </w:p>
     <w:p>
       <w:pPr>
         <w:pageBreakBefore/>
@@ -1629,6 +1142,22 @@
       <w:szCs w:val="20"/>
     </w:rPr>
   </w:style>
+  <w:style w:type="table" w:styleId="TableGrid">
+    <w:name w:val="Table Grid"/>
+    <w:basedOn w:val="TableNormal"/>
+    <w:uiPriority w:val="39"/>
+    <w:rsid w:val="006A3B52"/>
+    <w:tblPr>
+      <w:tblBorders>
+        <w:top w:val="single" w:sz="4" w:space="0" w:color="auto"/>
+        <w:left w:val="single" w:sz="4" w:space="0" w:color="auto"/>
+        <w:bottom w:val="single" w:sz="4" w:space="0" w:color="auto"/>
+        <w:right w:val="single" w:sz="4" w:space="0" w:color="auto"/>
+        <w:insideH w:val="single" w:sz="4" w:space="0" w:color="auto"/>
+        <w:insideV w:val="single" w:sz="4" w:space="0" w:color="auto"/>
+      </w:tblBorders>
+    </w:tblPr>
+  </w:style>
 </w:styles>
 </file>
 

</xml_diff>